<commit_message>
Add Model B technical description, design precedents and formal review
Model_B_Slides.pptx follows the lab deck style: end-to-end diagram, a
27-step table covering data, windows, preprocessing, network, training
and evaluation, a precedent for every design choice, changes since the
4/22 proposal, a false-positive plan and references.
Model_B_Technical_Description.docx carries the same content in writing.
Literature_Review_Formal.docx is a narrative review in the layout of
the Frontiers ECG paper, with 38 checked references.

Corrects an earlier error: Model B's input is z-scored per window with
no frequency filter, not band-passed. The earlier review, slide and
HANDOFF.md are updated to match.

Co-Authored-By: Claude Opus 5.5 <noreply@anthropic.com>
Claude-Session: https://claude.ai/code/session_01AtTQN8juVHUnnCJVsQQ1fw
</commit_message>
<xml_diff>
--- a/literature_review/Literature_Review.docx
+++ b/literature_review/Literature_Review.docx
@@ -3048,7 +3048,7 @@
                 <w:sz w:val="17"/>
                 <w:szCs w:val="17"/>
               </w:rPr>
-              <w:t xml:space="preserve">Band passed 4 channel time series, DC removed, missing samples excluded then zeroed</w:t>
+              <w:t xml:space="preserve">Z-scored 4 channel time series with no frequency filter, missing samples excluded then zeroed</w:t>
             </w:r>
           </w:p>
         </w:tc>
@@ -4156,7 +4156,7 @@
                 <w:sz w:val="17"/>
                 <w:szCs w:val="17"/>
               </w:rPr>
-              <w:t xml:space="preserve">Band passed time series and 1D CNN with attention</w:t>
+              <w:t xml:space="preserve">Z-scored time series and 1D CNN with attention</w:t>
             </w:r>
           </w:p>
         </w:tc>
@@ -4664,7 +4664,7 @@
                 <w:sz w:val="17"/>
                 <w:szCs w:val="17"/>
               </w:rPr>
-              <w:t xml:space="preserve">Time domain, band passed input</w:t>
+              <w:t xml:space="preserve">Time domain input</w:t>
             </w:r>
           </w:p>
         </w:tc>
@@ -4694,7 +4694,7 @@
                 <w:sz w:val="17"/>
                 <w:szCs w:val="17"/>
               </w:rPr>
-              <w:t xml:space="preserve">Raw four channel input in Ghosh and Sazonov 2022. Chewing band filtering in Doulah et al. 2021</w:t>
+              <w:t xml:space="preserve">Raw four channel input in Ghosh and Sazonov 2022</w:t>
             </w:r>
           </w:p>
         </w:tc>
@@ -7114,7 +7114,7 @@
           <w:sz w:val="22"/>
           <w:szCs w:val="22"/>
         </w:rPr>
-        <w:t xml:space="preserve">compact one dimensional convolutional network on band passed four channel time series</w:t>
+        <w:t xml:space="preserve">compact one dimensional convolutional network on z-scored four channel time series</w:t>
       </w:r>
       <w:r>
         <w:rPr>

</xml_diff>